<commit_message>
docs: sync updated blueprint with Zero Hardcoded Content Policy (100% Dynamic Content Engine)
</commit_message>
<xml_diff>
--- a/docs/20_PHASE_DEVELOPMENT_ROADMAP.docx
+++ b/docs/20_PHASE_DEVELOPMENT_ROADMAP.docx
@@ -5748,7 +5748,7 @@
           <w:color w:val="2D3748"/>
           <w:sz w:val="23"/>
         </w:rPr>
-        <w:t>🔹 PHASE 20: BUSINESS INTELLIGENCE, SYSTEM AUDIT TRAIL &amp; PRODUCTION QA</w:t>
+        <w:t>🔹 PHASE 20: DYNAMIC SETTINGS CMS (ZERO HARDCODING), BUSINESS INTELLIGENCE &amp; PRODUCTION QA</w:t>
       </w:r>
     </w:p>
     <w:p>
@@ -5771,7 +5771,7 @@
           <w:color w:val="2D3748"/>
           <w:sz w:val="20"/>
         </w:rPr>
-        <w:t xml:space="preserve"> Executive financial visibility, immutable audit logging, and production readiness.</w:t>
+        <w:t xml:space="preserve"> Complete centralized dynamic content management (eliminating all hardcoded assets), executive financial visibility, immutable audit logging, and production readiness.</w:t>
       </w:r>
     </w:p>
     <w:p>
@@ -5797,10 +5797,195 @@
       <w:r>
         <w:rPr>
           <w:rFonts w:ascii="Calibri" w:hAnsi="Calibri"/>
-          <w:color w:val="2D3748"/>
-          <w:sz w:val="20"/>
-        </w:rPr>
-        <w:t xml:space="preserve">Build </w:t>
+          <w:b/>
+          <w:color w:val="1A202C"/>
+          <w:sz w:val="20"/>
+        </w:rPr>
+        <w:t>Dynamic Content &amp; Settings CMS Engine (Zero Hardcoded Content):</w:t>
+      </w:r>
+    </w:p>
+    <w:p>
+      <w:pPr>
+        <w:pStyle w:val="ListBullet"/>
+        <w:spacing w:before="0" w:after="40"/>
+      </w:pPr>
+      <w:r>
+        <w:rPr>
+          <w:rFonts w:ascii="Calibri" w:hAnsi="Calibri"/>
+          <w:b/>
+          <w:color w:val="1A202C"/>
+          <w:sz w:val="20"/>
+        </w:rPr>
+        <w:t>Site Identity:</w:t>
+      </w:r>
+      <w:r>
+        <w:rPr>
+          <w:rFonts w:ascii="Calibri" w:hAnsi="Calibri"/>
+          <w:color w:val="2D3748"/>
+          <w:sz w:val="20"/>
+        </w:rPr>
+        <w:t xml:space="preserve"> Manage Site Name, Tagline, Main Logo, White Logo, Favicon, Copyright text.</w:t>
+      </w:r>
+    </w:p>
+    <w:p>
+      <w:pPr>
+        <w:pStyle w:val="ListBullet"/>
+        <w:spacing w:before="0" w:after="40"/>
+      </w:pPr>
+      <w:r>
+        <w:rPr>
+          <w:rFonts w:ascii="Calibri" w:hAnsi="Calibri"/>
+          <w:b/>
+          <w:color w:val="1A202C"/>
+          <w:sz w:val="20"/>
+        </w:rPr>
+        <w:t>Contact &amp; Support:</w:t>
+      </w:r>
+      <w:r>
+        <w:rPr>
+          <w:rFonts w:ascii="Calibri" w:hAnsi="Calibri"/>
+          <w:color w:val="2D3748"/>
+          <w:sz w:val="20"/>
+        </w:rPr>
+        <w:t xml:space="preserve"> Phone numbers, WhatsApp helpline, Support Email, Warehouse address, Google Maps embed URL.</w:t>
+      </w:r>
+    </w:p>
+    <w:p>
+      <w:pPr>
+        <w:pStyle w:val="ListBullet"/>
+        <w:spacing w:before="0" w:after="40"/>
+      </w:pPr>
+      <w:r>
+        <w:rPr>
+          <w:rFonts w:ascii="Calibri" w:hAnsi="Calibri"/>
+          <w:b/>
+          <w:color w:val="1A202C"/>
+          <w:sz w:val="20"/>
+        </w:rPr>
+        <w:t>Social Media:</w:t>
+      </w:r>
+      <w:r>
+        <w:rPr>
+          <w:rFonts w:ascii="Calibri" w:hAnsi="Calibri"/>
+          <w:color w:val="2D3748"/>
+          <w:sz w:val="20"/>
+        </w:rPr>
+        <w:t xml:space="preserve"> Links for Facebook, Instagram, YouTube, TikTok, LinkedIn, Twitter/X.</w:t>
+      </w:r>
+    </w:p>
+    <w:p>
+      <w:pPr>
+        <w:pStyle w:val="ListBullet"/>
+        <w:spacing w:before="0" w:after="40"/>
+      </w:pPr>
+      <w:r>
+        <w:rPr>
+          <w:rFonts w:ascii="Calibri" w:hAnsi="Calibri"/>
+          <w:b/>
+          <w:color w:val="1A202C"/>
+          <w:sz w:val="20"/>
+        </w:rPr>
+        <w:t>Commerce Configs:</w:t>
+      </w:r>
+      <w:r>
+        <w:rPr>
+          <w:rFonts w:ascii="Calibri" w:hAnsi="Calibri"/>
+          <w:color w:val="2D3748"/>
+          <w:sz w:val="20"/>
+        </w:rPr>
+        <w:t xml:space="preserve"> Default Currency Symbol/Code/Position, VAT/Tax rate %, Standard Delivery charge, Free Shipping threshold, Low-stock alert threshold.</w:t>
+      </w:r>
+    </w:p>
+    <w:p>
+      <w:pPr>
+        <w:pStyle w:val="ListBullet"/>
+        <w:spacing w:before="0" w:after="40"/>
+      </w:pPr>
+      <w:r>
+        <w:rPr>
+          <w:rFonts w:ascii="Calibri" w:hAnsi="Calibri"/>
+          <w:b/>
+          <w:color w:val="1A202C"/>
+          <w:sz w:val="20"/>
+        </w:rPr>
+        <w:t>Invoice Customization:</w:t>
+      </w:r>
+      <w:r>
+        <w:rPr>
+          <w:rFonts w:ascii="Calibri" w:hAnsi="Calibri"/>
+          <w:color w:val="2D3748"/>
+          <w:sz w:val="20"/>
+        </w:rPr>
+        <w:t xml:space="preserve"> Legal Company Name, VAT/BIN registration number, invoice terms &amp; footer notices.</w:t>
+      </w:r>
+    </w:p>
+    <w:p>
+      <w:pPr>
+        <w:pStyle w:val="ListBullet"/>
+        <w:spacing w:before="0" w:after="40"/>
+      </w:pPr>
+      <w:r>
+        <w:rPr>
+          <w:rFonts w:ascii="Calibri" w:hAnsi="Calibri"/>
+          <w:b/>
+          <w:color w:val="1A202C"/>
+          <w:sz w:val="20"/>
+        </w:rPr>
+        <w:t>Homepage Banner CMS:</w:t>
+      </w:r>
+      <w:r>
+        <w:rPr>
+          <w:rFonts w:ascii="Calibri" w:hAnsi="Calibri"/>
+          <w:color w:val="2D3748"/>
+          <w:sz w:val="20"/>
+        </w:rPr>
+        <w:t xml:space="preserve"> Manage Hero slider items (images, headings, sub-titles, button URLs), Promo banners, and Announcement top ticker.</w:t>
+      </w:r>
+    </w:p>
+    <w:p>
+      <w:pPr>
+        <w:pStyle w:val="ListBullet"/>
+        <w:spacing w:before="0" w:after="40"/>
+      </w:pPr>
+      <w:r>
+        <w:rPr>
+          <w:rFonts w:ascii="Calibri" w:hAnsi="Calibri"/>
+          <w:b/>
+          <w:color w:val="1A202C"/>
+          <w:sz w:val="20"/>
+        </w:rPr>
+        <w:t>Dynamic Policy Pages:</w:t>
+      </w:r>
+      <w:r>
+        <w:rPr>
+          <w:rFonts w:ascii="Calibri" w:hAnsi="Calibri"/>
+          <w:color w:val="2D3748"/>
+          <w:sz w:val="20"/>
+        </w:rPr>
+        <w:t xml:space="preserve"> Full WYSIWYG editor for About Us, Terms &amp; Conditions, Privacy Policy, Return &amp; Refund Policy, FAQ.</w:t>
+      </w:r>
+    </w:p>
+    <w:p>
+      <w:pPr>
+        <w:pStyle w:val="ListBullet"/>
+        <w:spacing w:before="0" w:after="40"/>
+      </w:pPr>
+      <w:r>
+        <w:rPr>
+          <w:rFonts w:ascii="Calibri" w:hAnsi="Calibri"/>
+          <w:b/>
+          <w:color w:val="1A202C"/>
+          <w:sz w:val="20"/>
+        </w:rPr>
+        <w:t>Global Shared Props:</w:t>
+      </w:r>
+      <w:r>
+        <w:rPr>
+          <w:rFonts w:ascii="Calibri" w:hAnsi="Calibri"/>
+          <w:color w:val="2D3748"/>
+          <w:sz w:val="20"/>
+        </w:rPr>
+        <w:t xml:space="preserve"> Settings cached in Redis and shared via </w:t>
       </w:r>
       <w:r>
         <w:rPr>
@@ -5809,15 +5994,47 @@
           <w:color w:val="C53030"/>
           <w:sz w:val="19"/>
         </w:rPr>
-        <w:t>BusinessAnalyticsService.php</w:t>
-      </w:r>
-      <w:r>
-        <w:rPr>
-          <w:rFonts w:ascii="Calibri" w:hAnsi="Calibri"/>
-          <w:color w:val="2D3748"/>
-          <w:sz w:val="20"/>
-        </w:rPr>
-        <w:t>:</w:t>
+        <w:t>HandleInertiaRequests.php</w:t>
+      </w:r>
+      <w:r>
+        <w:rPr>
+          <w:rFonts w:ascii="Calibri" w:hAnsi="Calibri"/>
+          <w:color w:val="2D3748"/>
+          <w:sz w:val="20"/>
+        </w:rPr>
+        <w:t xml:space="preserve"> (</w:t>
+      </w:r>
+      <w:r>
+        <w:rPr>
+          <w:rFonts w:ascii="Consolas" w:hAnsi="Consolas"/>
+          <w:b/>
+          <w:color w:val="C53030"/>
+          <w:sz w:val="19"/>
+        </w:rPr>
+        <w:t>$page.props.settings</w:t>
+      </w:r>
+      <w:r>
+        <w:rPr>
+          <w:rFonts w:ascii="Calibri" w:hAnsi="Calibri"/>
+          <w:color w:val="2D3748"/>
+          <w:sz w:val="20"/>
+        </w:rPr>
+        <w:t>) with zero duplicate queries.</w:t>
+      </w:r>
+    </w:p>
+    <w:p>
+      <w:pPr>
+        <w:pStyle w:val="ListNumber"/>
+        <w:spacing w:before="0" w:after="40"/>
+      </w:pPr>
+      <w:r>
+        <w:rPr>
+          <w:rFonts w:ascii="Calibri" w:hAnsi="Calibri"/>
+          <w:b/>
+          <w:color w:val="1A202C"/>
+          <w:sz w:val="20"/>
+        </w:rPr>
+        <w:t>Business Analytics BI:</w:t>
       </w:r>
     </w:p>
     <w:p>
@@ -5888,10 +6105,19 @@
       <w:r>
         <w:rPr>
           <w:rFonts w:ascii="Calibri" w:hAnsi="Calibri"/>
-          <w:color w:val="2D3748"/>
-          <w:sz w:val="20"/>
-        </w:rPr>
-        <w:t xml:space="preserve">Create </w:t>
+          <w:b/>
+          <w:color w:val="1A202C"/>
+          <w:sz w:val="20"/>
+        </w:rPr>
+        <w:t>Audit Trail:</w:t>
+      </w:r>
+      <w:r>
+        <w:rPr>
+          <w:rFonts w:ascii="Calibri" w:hAnsi="Calibri"/>
+          <w:color w:val="2D3748"/>
+          <w:sz w:val="20"/>
+        </w:rPr>
+        <w:t xml:space="preserve"> </w:t>
       </w:r>
       <w:r>
         <w:rPr>
@@ -5919,24 +6145,19 @@
       <w:r>
         <w:rPr>
           <w:rFonts w:ascii="Calibri" w:hAnsi="Calibri"/>
-          <w:color w:val="2D3748"/>
-          <w:sz w:val="20"/>
-        </w:rPr>
-        <w:t>Build Store Settings manager (currency, VAT rate, contact details, shipping rules).</w:t>
-      </w:r>
-    </w:p>
-    <w:p>
-      <w:pPr>
-        <w:pStyle w:val="ListNumber"/>
-        <w:spacing w:before="0" w:after="40"/>
-      </w:pPr>
-      <w:r>
-        <w:rPr>
-          <w:rFonts w:ascii="Calibri" w:hAnsi="Calibri"/>
-          <w:color w:val="2D3748"/>
-          <w:sz w:val="20"/>
-        </w:rPr>
-        <w:t xml:space="preserve">Create comprehensive </w:t>
+          <w:b/>
+          <w:color w:val="1A202C"/>
+          <w:sz w:val="20"/>
+        </w:rPr>
+        <w:t>Production QA:</w:t>
+      </w:r>
+      <w:r>
+        <w:rPr>
+          <w:rFonts w:ascii="Calibri" w:hAnsi="Calibri"/>
+          <w:color w:val="2D3748"/>
+          <w:sz w:val="20"/>
+        </w:rPr>
+        <w:t xml:space="preserve"> Comprehensive </w:t>
       </w:r>
       <w:r>
         <w:rPr>
@@ -5969,6 +6190,38 @@
           <w:sz w:val="20"/>
         </w:rPr>
         <w:t>🧪 Verification Checkpoint:</w:t>
+      </w:r>
+    </w:p>
+    <w:p>
+      <w:pPr>
+        <w:pStyle w:val="ListBullet"/>
+        <w:spacing w:before="0" w:after="40"/>
+      </w:pPr>
+      <w:r>
+        <w:rPr>
+          <w:rFonts w:ascii="Calibri" w:hAnsi="Calibri"/>
+          <w:color w:val="2D3748"/>
+          <w:sz w:val="20"/>
+        </w:rPr>
+        <w:t xml:space="preserve">Update Logo, Phone, Currency Symbol, and Hero Banner in Admin </w:t>
+      </w:r>
+      <w:r>
+        <w:rPr>
+          <w:rFonts w:ascii="Cambria Math" w:hAnsi="Cambria Math"/>
+          <w:b/>
+          <w:i/>
+          <w:color w:val="2C5282"/>
+          <w:sz w:val="20"/>
+        </w:rPr>
+        <w:t>\to</w:t>
+      </w:r>
+      <w:r>
+        <w:rPr>
+          <w:rFonts w:ascii="Calibri" w:hAnsi="Calibri"/>
+          <w:color w:val="2D3748"/>
+          <w:sz w:val="20"/>
+        </w:rPr>
+        <w:t xml:space="preserve"> verify instantaneous reflection across entire storefront header, footer, checkout, and invoices without any hardcoded text.</w:t>
       </w:r>
     </w:p>
     <w:p>

</xml_diff>